<commit_message>
updating asgt materials to include the annotated bib; renaming toolbox due to abundance of web resources (rather than word proc)
</commit_message>
<xml_diff>
--- a/TechComm/assignments/proposal/ai-prompt-to-check-your-proposal.docx
+++ b/TechComm/assignments/proposal/ai-prompt-to-check-your-proposal.docx
@@ -84,7 +84,7 @@
         <w:rPr>
           <w:rFonts w:ascii="Calibri" w:hAnsi="Calibri" w:cs="Calibri"/>
         </w:rPr>
-        <w:t>My proposal is approximately 4–5 pages or longer, uses 1-inch margins, and numbers pages 2 through the end without numbering the first page.</w:t>
+        <w:t>My proposal is approximately 7–9 pages or longer, including the Gantt chart and annotated bibliography, uses 1-inch margins, and numbers pages 2 through the end without numbering the first page.</w:t>
       </w:r>
     </w:p>
     <w:p>
@@ -105,19 +105,19 @@
         <w:rPr>
           <w:rFonts w:ascii="Calibri" w:hAnsi="Calibri" w:cs="Calibri"/>
         </w:rPr>
-        <w:t xml:space="preserve">My proposal includes memo headers, </w:t>
-      </w:r>
-      <w:r>
-        <w:rPr>
-          <w:rFonts w:ascii="Calibri" w:hAnsi="Calibri" w:cs="Calibri"/>
-        </w:rPr>
-        <w:t>an introduction without a heading</w:t>
-      </w:r>
-      <w:r>
-        <w:rPr>
-          <w:rFonts w:ascii="Calibri" w:hAnsi="Calibri" w:cs="Calibri"/>
-        </w:rPr>
-        <w:t>, Proposed Program, Qualifications and Experience, a Task Schedule or Proposed Timeline, and a References/Works Cited/Bibliography page. I did not add a Summary or Budget.</w:t>
+        <w:t>My proposal includes memo headers, an introduction without a heading, Proposed Program, Qualifications and Experience, a Task Schedule or Proposed Timeline, and an Annotated Bibliography. I did not add a</w:t>
+      </w:r>
+      <w:r>
+        <w:rPr>
+          <w:rFonts w:ascii="Calibri" w:hAnsi="Calibri" w:cs="Calibri"/>
+        </w:rPr>
+        <w:t>n Executive</w:t>
+      </w:r>
+      <w:r>
+        <w:rPr>
+          <w:rFonts w:ascii="Calibri" w:hAnsi="Calibri" w:cs="Calibri"/>
+        </w:rPr>
+        <w:t xml:space="preserve"> Summary or Budget.</w:t>
       </w:r>
     </w:p>
     <w:p>
@@ -231,20 +231,20 @@
       </w:pPr>
       <w:r>
         <w:lastRenderedPageBreak/>
-        <w:t>Research Sources</w:t>
-      </w:r>
-    </w:p>
-    <w:p>
-      <w:pPr>
-        <w:rPr>
-          <w:rFonts w:ascii="Calibri" w:hAnsi="Calibri" w:cs="Calibri"/>
-        </w:rPr>
-      </w:pPr>
-      <w:r>
-        <w:rPr>
-          <w:rFonts w:ascii="Calibri" w:hAnsi="Calibri" w:cs="Calibri"/>
-        </w:rPr>
-        <w:t>My proposal uses at least three credible outside sources, including relevant standards, guidelines, research, and/or professional recommendations that help establish why the document warrants investigation or provide resources for my evaluation.</w:t>
+        <w:t>Research Sources &amp; Citations</w:t>
+      </w:r>
+    </w:p>
+    <w:p>
+      <w:pPr>
+        <w:rPr>
+          <w:rFonts w:ascii="Calibri" w:hAnsi="Calibri" w:cs="Calibri"/>
+        </w:rPr>
+      </w:pPr>
+      <w:r>
+        <w:rPr>
+          <w:rFonts w:ascii="Calibri" w:hAnsi="Calibri" w:cs="Calibri"/>
+        </w:rPr>
+        <w:t>My proposal uses at least five credible outside sources, including relevant standards, guidelines, research, and/or professional recommendations that help establish why the document warrants investigation or provide resources for my evaluation. I cite information used in the proposal according to the documentation style appropriate to my discipline.</w:t>
       </w:r>
     </w:p>
     <w:p>
@@ -252,20 +252,20 @@
         <w:pStyle w:val="Heading2"/>
       </w:pPr>
       <w:r>
-        <w:t>Source Documentation</w:t>
-      </w:r>
-    </w:p>
-    <w:p>
-      <w:pPr>
-        <w:rPr>
-          <w:rFonts w:ascii="Calibri" w:hAnsi="Calibri" w:cs="Calibri"/>
-        </w:rPr>
-      </w:pPr>
-      <w:r>
-        <w:rPr>
-          <w:rFonts w:ascii="Calibri" w:hAnsi="Calibri" w:cs="Calibri"/>
-        </w:rPr>
-        <w:t>I cite information from outside sources in the text and include every cited source on a References, Works Cited, or Bibliography page, using the documentation style appropriate to my discipline.</w:t>
+        <w:t>Annotated Bibliography</w:t>
+      </w:r>
+    </w:p>
+    <w:p>
+      <w:pPr>
+        <w:rPr>
+          <w:rFonts w:ascii="Calibri" w:hAnsi="Calibri" w:cs="Calibri"/>
+        </w:rPr>
+      </w:pPr>
+      <w:r>
+        <w:rPr>
+          <w:rFonts w:ascii="Calibri" w:hAnsi="Calibri" w:cs="Calibri"/>
+        </w:rPr>
+        <w:t>My annotated bibliography includes at least five sources. Each entry includes a complete citation, a concise and objective summary with an explanation of how the source can support my evaluation, and two quotations I may use in the recommendation report.</w:t>
       </w:r>
     </w:p>
     <w:p>
@@ -383,35 +383,7 @@
         <w:rPr>
           <w:rFonts w:ascii="Calibri" w:hAnsi="Calibri" w:cs="Calibri"/>
         </w:rPr>
-        <w:t xml:space="preserve">If you cannot verify a requirement from the uploaded </w:t>
-      </w:r>
-      <w:proofErr w:type="gramStart"/>
-      <w:r>
-        <w:rPr>
-          <w:rFonts w:ascii="Calibri" w:hAnsi="Calibri" w:cs="Calibri"/>
-        </w:rPr>
-        <w:t>draft—</w:t>
-      </w:r>
-      <w:proofErr w:type="gramEnd"/>
-      <w:r>
-        <w:rPr>
-          <w:rFonts w:ascii="Calibri" w:hAnsi="Calibri" w:cs="Calibri"/>
-        </w:rPr>
-        <w:t xml:space="preserve">for example, page dimensions, margins, page numbering, or another formatting </w:t>
-      </w:r>
-      <w:proofErr w:type="gramStart"/>
-      <w:r>
-        <w:rPr>
-          <w:rFonts w:ascii="Calibri" w:hAnsi="Calibri" w:cs="Calibri"/>
-        </w:rPr>
-        <w:t>feature—</w:t>
-      </w:r>
-      <w:proofErr w:type="gramEnd"/>
-      <w:r>
-        <w:rPr>
-          <w:rFonts w:ascii="Calibri" w:hAnsi="Calibri" w:cs="Calibri"/>
-        </w:rPr>
-        <w:t>tell me that you cannot verify it rather than assuming that I have met the requirement.</w:t>
+        <w:t>If you cannot verify a requirement from the uploaded draft—for example, page dimensions, margins, page numbering, or another formatting feature—tell me that you cannot verify it rather than assuming that I have met the requirement.</w:t>
       </w:r>
     </w:p>
     <w:p>
@@ -1053,6 +1025,7 @@
   <w:style w:type="character" w:default="1" w:styleId="DefaultParagraphFont">
     <w:name w:val="Default Paragraph Font"/>
     <w:uiPriority w:val="1"/>
+    <w:semiHidden/>
     <w:unhideWhenUsed/>
   </w:style>
   <w:style w:type="table" w:default="1" w:styleId="TableNormal">

</xml_diff>